<commit_message>
Rewrite CV in short natural Arabic
Keep only useful facts, drop AI-style fluff, and regenerate the Word files.

Co-authored-by: abdelrahman Hamdy <abdoe317111@gmail.com>
</commit_message>
<xml_diff>
--- a/CV-Mahmoud-Hamed.docx
+++ b/CV-Mahmoud-Hamed.docx
@@ -13,14 +13,14 @@
           <w:rFonts w:ascii="Arial" w:hAnsi="Arial" w:cs="Arial" w:eastAsia="Arial"/>
           <w:b/>
           <w:color w:val="0B4F6C"/>
-          <w:sz w:val="44"/>
+          <w:sz w:val="40"/>
         </w:rPr>
         <w:t>محمود محمد عبدالفتاح حامد</w:t>
       </w:r>
     </w:p>
     <w:p>
       <w:pPr>
-        <w:spacing w:after="120" w:before="0" w:line="240" w:lineRule="auto"/>
+        <w:spacing w:after="80" w:before="0" w:line="240" w:lineRule="auto"/>
         <w:jc w:val="center"/>
         <w:bidi w:val="1"/>
       </w:pPr>
@@ -31,7 +31,7 @@
           <w:color w:val="1A2332"/>
           <w:sz w:val="24"/>
         </w:rPr>
-        <w:t>منسّق عمليات التوصيل (Dispatcher) | طالب علوم حاسب — متوقع التخرج 2027</w:t>
+        <w:t>Dispatcher | طالب علوم حاسب</w:t>
       </w:r>
     </w:p>
     <w:p>
@@ -50,12 +50,12 @@
           <w:color w:val="5C6B7A"/>
           <w:sz w:val="20"/>
         </w:rPr>
-        <w:t>الهاتف: 01102600149   |   البريد: hhuumahmoud@gmail.com   |   القاهرة، مصر</w:t>
+        <w:t>01102600149  |  hhuumahmoud@gmail.com  |  القاهرة</w:t>
       </w:r>
     </w:p>
     <w:p>
       <w:pPr>
-        <w:spacing w:after="160" w:before="280" w:line="240" w:lineRule="auto"/>
+        <w:spacing w:after="160" w:before="240" w:line="240" w:lineRule="auto"/>
         <w:jc w:val="right"/>
         <w:bidi w:val="1"/>
         <w:pBdr>
@@ -67,76 +67,9 @@
           <w:rFonts w:ascii="Arial" w:hAnsi="Arial" w:cs="Arial" w:eastAsia="Arial"/>
           <w:b/>
           <w:color w:val="0B4F6C"/>
-          <w:sz w:val="28"/>
+          <w:sz w:val="26"/>
         </w:rPr>
-        <w:t>الملف المهني</w:t>
-      </w:r>
-    </w:p>
-    <w:p>
-      <w:pPr>
-        <w:spacing w:after="160" w:before="0" w:line="240" w:lineRule="auto"/>
-        <w:jc w:val="right"/>
-        <w:bidi w:val="1"/>
-      </w:pPr>
-      <w:r>
-        <w:rPr>
-          <w:rFonts w:ascii="Arial" w:hAnsi="Arial" w:cs="Arial" w:eastAsia="Arial"/>
-          <w:b w:val="0"/>
-          <w:color w:val="1A2332"/>
-          <w:sz w:val="22"/>
-        </w:rPr>
-        <w:t>منسّق عمليات توصيل بخبرة عملية في بيئات التجارة السريعة والتوصيل عند الطلب، مع قدرة واضحة على إدارة الطلبات في الوقت الفعلي، والتنسيق بين فرق التوصيل والدعم والعملاء، والمتابعة الدقيقة لمؤشرات الأداء. أجمع بين مهارات التنظيم والعمل تحت الضغط وبين خلفية أكاديمية في علوم الحاسب، وأسعى للانضمام إلى مؤسسة كبرى تتيح فرص تطور مهني في مجالات العمليات، خدمة العملاء، أو دعم الأنظمة التشغيلية.</w:t>
-      </w:r>
-    </w:p>
-    <w:p>
-      <w:pPr>
-        <w:spacing w:after="160" w:before="280" w:line="240" w:lineRule="auto"/>
-        <w:jc w:val="right"/>
-        <w:bidi w:val="1"/>
-        <w:pBdr>
-          <w:bottom w:val="single" w:sz="18" w:space="4" w:color="0B4F6C"/>
-        </w:pBdr>
-      </w:pPr>
-      <w:r>
-        <w:rPr>
-          <w:rFonts w:ascii="Arial" w:hAnsi="Arial" w:cs="Arial" w:eastAsia="Arial"/>
-          <w:b/>
-          <w:color w:val="0B4F6C"/>
-          <w:sz w:val="28"/>
-        </w:rPr>
-        <w:t>الخبرة الوظيفية</w:t>
-      </w:r>
-    </w:p>
-    <w:p>
-      <w:pPr>
-        <w:spacing w:after="40" w:before="0" w:line="240" w:lineRule="auto"/>
-        <w:jc w:val="right"/>
-        <w:bidi w:val="1"/>
-      </w:pPr>
-      <w:r>
-        <w:rPr>
-          <w:rFonts w:ascii="Arial" w:hAnsi="Arial" w:cs="Arial" w:eastAsia="Arial"/>
-          <w:b/>
-          <w:color w:val="1A2332"/>
-          <w:sz w:val="24"/>
-        </w:rPr>
-        <w:t>منسّق عمليات التوصيل (Dispatcher) — Breadfast</w:t>
-      </w:r>
-    </w:p>
-    <w:p>
-      <w:pPr>
-        <w:spacing w:after="80" w:before="0" w:line="240" w:lineRule="auto"/>
-        <w:jc w:val="right"/>
-        <w:bidi w:val="1"/>
-      </w:pPr>
-      <w:r>
-        <w:rPr>
-          <w:rFonts w:ascii="Arial" w:hAnsi="Arial" w:cs="Arial" w:eastAsia="Arial"/>
-          <w:b w:val="0"/>
-          <w:color w:val="5C6B7A"/>
-          <w:sz w:val="20"/>
-        </w:rPr>
-        <w:t>يناير 2026 — يونيو 2026</w:t>
+        <w:t>نبذة</w:t>
       </w:r>
     </w:p>
     <w:p>
@@ -152,230 +85,12 @@
           <w:color w:val="1A2332"/>
           <w:sz w:val="22"/>
         </w:rPr>
-        <w:t>العمل ضمن فريق العمليات لضمان تدفق الطلبات بسلاسة عبر تطبيق التوصيل السريع، مع التركيز على سرعة الاستجابة وجودة التنفيذ ودقة المتابعة.</w:t>
+        <w:t>شغال Dispatcher في شركات توصيل، وبطالب علوم حاسب سنة تالتة. متعود أوزع أوردرات، أتابع المناديب، وأحل مشاكل الشيفت بسرعة.</w:t>
       </w:r>
     </w:p>
     <w:p>
       <w:pPr>
-        <w:pStyle w:val="ListBullet"/>
-        <w:spacing w:after="80" w:before="0" w:line="240" w:lineRule="auto"/>
-        <w:jc w:val="right"/>
-        <w:bidi w:val="1"/>
-      </w:pPr>
-      <w:r>
-        <w:rPr>
-          <w:rFonts w:ascii="Arial" w:hAnsi="Arial" w:cs="Arial" w:eastAsia="Arial"/>
-          <w:b w:val="0"/>
-          <w:color w:val="1A2332"/>
-          <w:sz w:val="22"/>
-        </w:rPr>
-        <w:t>استقبال الطلبات الواردة وتوزيعها على مندوبي التوصيل وفق المناطق والأولوية وكفاءة التغطية المتاحة.</w:t>
-      </w:r>
-    </w:p>
-    <w:p>
-      <w:pPr>
-        <w:pStyle w:val="ListBullet"/>
-        <w:spacing w:after="80" w:before="0" w:line="240" w:lineRule="auto"/>
-        <w:jc w:val="right"/>
-        <w:bidi w:val="1"/>
-      </w:pPr>
-      <w:r>
-        <w:rPr>
-          <w:rFonts w:ascii="Arial" w:hAnsi="Arial" w:cs="Arial" w:eastAsia="Arial"/>
-          <w:b w:val="0"/>
-          <w:color w:val="1A2332"/>
-          <w:sz w:val="22"/>
-        </w:rPr>
-        <w:t>متابعة حالة الطلبات لحظة بلحظة والتدخل السريع عند التأخير أو إعادة التوجيه أو حالات الذروة.</w:t>
-      </w:r>
-    </w:p>
-    <w:p>
-      <w:pPr>
-        <w:pStyle w:val="ListBullet"/>
-        <w:spacing w:after="80" w:before="0" w:line="240" w:lineRule="auto"/>
-        <w:jc w:val="right"/>
-        <w:bidi w:val="1"/>
-      </w:pPr>
-      <w:r>
-        <w:rPr>
-          <w:rFonts w:ascii="Arial" w:hAnsi="Arial" w:cs="Arial" w:eastAsia="Arial"/>
-          <w:b w:val="0"/>
-          <w:color w:val="1A2332"/>
-          <w:sz w:val="22"/>
-        </w:rPr>
-        <w:t>التنسيق المستمر مع فرق الدعم والتشغيل لمعالجة المشكلات التشغيلية وتقليل زمن الاستجابة.</w:t>
-      </w:r>
-    </w:p>
-    <w:p>
-      <w:pPr>
-        <w:pStyle w:val="ListBullet"/>
-        <w:spacing w:after="80" w:before="0" w:line="240" w:lineRule="auto"/>
-        <w:jc w:val="right"/>
-        <w:bidi w:val="1"/>
-      </w:pPr>
-      <w:r>
-        <w:rPr>
-          <w:rFonts w:ascii="Arial" w:hAnsi="Arial" w:cs="Arial" w:eastAsia="Arial"/>
-          <w:b w:val="0"/>
-          <w:color w:val="1A2332"/>
-          <w:sz w:val="22"/>
-        </w:rPr>
-        <w:t>متابعة مؤشرات الأداء الأساسية مثل زمن التوصيل، نسبة الإنجاز، وكفاءة توزيع الطلبات.</w:t>
-      </w:r>
-    </w:p>
-    <w:p>
-      <w:pPr>
-        <w:pStyle w:val="ListBullet"/>
-        <w:spacing w:after="80" w:before="0" w:line="240" w:lineRule="auto"/>
-        <w:jc w:val="right"/>
-        <w:bidi w:val="1"/>
-      </w:pPr>
-      <w:r>
-        <w:rPr>
-          <w:rFonts w:ascii="Arial" w:hAnsi="Arial" w:cs="Arial" w:eastAsia="Arial"/>
-          <w:b w:val="0"/>
-          <w:color w:val="1A2332"/>
-          <w:sz w:val="22"/>
-        </w:rPr>
-        <w:t>التعامل الاحترافي مع الملاحظات الميدانية ورفع التقارير اليومية لدعم اتخاذ القرار التشغيلي.</w:t>
-      </w:r>
-    </w:p>
-    <w:p>
-      <w:pPr>
-        <w:spacing w:after="40" w:before="200" w:line="240" w:lineRule="auto"/>
-        <w:jc w:val="right"/>
-        <w:bidi w:val="1"/>
-      </w:pPr>
-      <w:r>
-        <w:rPr>
-          <w:rFonts w:ascii="Arial" w:hAnsi="Arial" w:cs="Arial" w:eastAsia="Arial"/>
-          <w:b/>
-          <w:color w:val="1A2332"/>
-          <w:sz w:val="24"/>
-        </w:rPr>
-        <w:t>منسّق عمليات التوصيل (Dispatcher) — InstaShop</w:t>
-      </w:r>
-    </w:p>
-    <w:p>
-      <w:pPr>
-        <w:spacing w:after="80" w:before="0" w:line="240" w:lineRule="auto"/>
-        <w:jc w:val="right"/>
-        <w:bidi w:val="1"/>
-      </w:pPr>
-      <w:r>
-        <w:rPr>
-          <w:rFonts w:ascii="Arial" w:hAnsi="Arial" w:cs="Arial" w:eastAsia="Arial"/>
-          <w:b w:val="0"/>
-          <w:color w:val="5C6B7A"/>
-          <w:sz w:val="20"/>
-        </w:rPr>
-        <w:t>2024 — 2025</w:t>
-      </w:r>
-    </w:p>
-    <w:p>
-      <w:pPr>
-        <w:spacing w:after="120" w:before="0" w:line="240" w:lineRule="auto"/>
-        <w:jc w:val="right"/>
-        <w:bidi w:val="1"/>
-      </w:pPr>
-      <w:r>
-        <w:rPr>
-          <w:rFonts w:ascii="Arial" w:hAnsi="Arial" w:cs="Arial" w:eastAsia="Arial"/>
-          <w:b w:val="0"/>
-          <w:color w:val="1A2332"/>
-          <w:sz w:val="22"/>
-        </w:rPr>
-        <w:t>خبرة لمدة عام في بيئة توصيل سريعة الإيقاع، مع مسؤولية مباشرة عن تنظيم حركة المندوبين وضمان التزام الطلبات بالجداول الزمنية المتفق عليها.</w:t>
-      </w:r>
-    </w:p>
-    <w:p>
-      <w:pPr>
-        <w:pStyle w:val="ListBullet"/>
-        <w:spacing w:after="80" w:before="0" w:line="240" w:lineRule="auto"/>
-        <w:jc w:val="right"/>
-        <w:bidi w:val="1"/>
-      </w:pPr>
-      <w:r>
-        <w:rPr>
-          <w:rFonts w:ascii="Arial" w:hAnsi="Arial" w:cs="Arial" w:eastAsia="Arial"/>
-          <w:b w:val="0"/>
-          <w:color w:val="1A2332"/>
-          <w:sz w:val="22"/>
-        </w:rPr>
-        <w:t>إدارة وتنظيم جداول التوصيل اليومية وتوزيع المهام بما يحقق أفضل استفادة من الموارد المتاحة.</w:t>
-      </w:r>
-    </w:p>
-    <w:p>
-      <w:pPr>
-        <w:pStyle w:val="ListBullet"/>
-        <w:spacing w:after="80" w:before="0" w:line="240" w:lineRule="auto"/>
-        <w:jc w:val="right"/>
-        <w:bidi w:val="1"/>
-      </w:pPr>
-      <w:r>
-        <w:rPr>
-          <w:rFonts w:ascii="Arial" w:hAnsi="Arial" w:cs="Arial" w:eastAsia="Arial"/>
-          <w:b w:val="0"/>
-          <w:color w:val="1A2332"/>
-          <w:sz w:val="22"/>
-        </w:rPr>
-        <w:t>متابعة أداء المناديب ميدانيًا ودعمهم في حل المشكلات اللوجستية أثناء تنفيذ الطلبات.</w:t>
-      </w:r>
-    </w:p>
-    <w:p>
-      <w:pPr>
-        <w:pStyle w:val="ListBullet"/>
-        <w:spacing w:after="80" w:before="0" w:line="240" w:lineRule="auto"/>
-        <w:jc w:val="right"/>
-        <w:bidi w:val="1"/>
-      </w:pPr>
-      <w:r>
-        <w:rPr>
-          <w:rFonts w:ascii="Arial" w:hAnsi="Arial" w:cs="Arial" w:eastAsia="Arial"/>
-          <w:b w:val="0"/>
-          <w:color w:val="1A2332"/>
-          <w:sz w:val="22"/>
-        </w:rPr>
-        <w:t>التواصل الفعّال مع العملاء عند الحاجة لتوضيح حالة الطلب أو ترتيب حلول بديلة عند الطوارئ.</w:t>
-      </w:r>
-    </w:p>
-    <w:p>
-      <w:pPr>
-        <w:pStyle w:val="ListBullet"/>
-        <w:spacing w:after="80" w:before="0" w:line="240" w:lineRule="auto"/>
-        <w:jc w:val="right"/>
-        <w:bidi w:val="1"/>
-      </w:pPr>
-      <w:r>
-        <w:rPr>
-          <w:rFonts w:ascii="Arial" w:hAnsi="Arial" w:cs="Arial" w:eastAsia="Arial"/>
-          <w:b w:val="0"/>
-          <w:color w:val="1A2332"/>
-          <w:sz w:val="22"/>
-        </w:rPr>
-        <w:t>المساهمة في تحسين انسيابية العمليات اليومية من خلال الالتزام بالإجراءات ومعايير الجودة.</w:t>
-      </w:r>
-    </w:p>
-    <w:p>
-      <w:pPr>
-        <w:pStyle w:val="ListBullet"/>
-        <w:spacing w:after="80" w:before="0" w:line="240" w:lineRule="auto"/>
-        <w:jc w:val="right"/>
-        <w:bidi w:val="1"/>
-      </w:pPr>
-      <w:r>
-        <w:rPr>
-          <w:rFonts w:ascii="Arial" w:hAnsi="Arial" w:cs="Arial" w:eastAsia="Arial"/>
-          <w:b w:val="0"/>
-          <w:color w:val="1A2332"/>
-          <w:sz w:val="22"/>
-        </w:rPr>
-        <w:t>العمل ضمن فريق متعدد المهام مع الحفاظ على الدقة والهدوء خلال فترات الضغط العالي.</w:t>
-      </w:r>
-    </w:p>
-    <w:p>
-      <w:pPr>
-        <w:spacing w:after="160" w:before="280" w:line="240" w:lineRule="auto"/>
+        <w:spacing w:after="160" w:before="240" w:line="240" w:lineRule="auto"/>
         <w:jc w:val="right"/>
         <w:bidi w:val="1"/>
         <w:pBdr>
@@ -387,14 +102,14 @@
           <w:rFonts w:ascii="Arial" w:hAnsi="Arial" w:cs="Arial" w:eastAsia="Arial"/>
           <w:b/>
           <w:color w:val="0B4F6C"/>
-          <w:sz w:val="28"/>
+          <w:sz w:val="26"/>
         </w:rPr>
-        <w:t>التعليم</w:t>
+        <w:t>الخبرة</w:t>
       </w:r>
     </w:p>
     <w:p>
       <w:pPr>
-        <w:spacing w:after="40" w:before="0" w:line="240" w:lineRule="auto"/>
+        <w:spacing w:after="20" w:before="0" w:line="240" w:lineRule="auto"/>
         <w:jc w:val="right"/>
         <w:bidi w:val="1"/>
       </w:pPr>
@@ -405,12 +120,79 @@
           <w:color w:val="1A2332"/>
           <w:sz w:val="24"/>
         </w:rPr>
-        <w:t>بكالوريوس علوم الحاسب</w:t>
+        <w:t>Dispatcher — Breadfast</w:t>
       </w:r>
     </w:p>
     <w:p>
       <w:pPr>
-        <w:spacing w:after="40" w:before="0" w:line="240" w:lineRule="auto"/>
+        <w:spacing w:after="60" w:before="0" w:line="240" w:lineRule="auto"/>
+        <w:jc w:val="right"/>
+        <w:bidi w:val="1"/>
+      </w:pPr>
+      <w:r>
+        <w:rPr>
+          <w:rFonts w:ascii="Arial" w:hAnsi="Arial" w:cs="Arial" w:eastAsia="Arial"/>
+          <w:b w:val="0"/>
+          <w:color w:val="5C6B7A"/>
+          <w:sz w:val="20"/>
+        </w:rPr>
+        <w:t>يناير 2026 – يونيو 2026</w:t>
+      </w:r>
+    </w:p>
+    <w:p>
+      <w:pPr>
+        <w:pStyle w:val="ListBullet"/>
+        <w:spacing w:after="60" w:before="0" w:line="240" w:lineRule="auto"/>
+        <w:jc w:val="right"/>
+        <w:bidi w:val="1"/>
+      </w:pPr>
+      <w:r>
+        <w:rPr>
+          <w:rFonts w:ascii="Arial" w:hAnsi="Arial" w:cs="Arial" w:eastAsia="Arial"/>
+          <w:b w:val="0"/>
+          <w:color w:val="1A2332"/>
+          <w:sz w:val="22"/>
+        </w:rPr>
+        <w:t>توزيع الأوردرات على المناديب حسب المنطقة والوقت.</w:t>
+      </w:r>
+    </w:p>
+    <w:p>
+      <w:pPr>
+        <w:pStyle w:val="ListBullet"/>
+        <w:spacing w:after="60" w:before="0" w:line="240" w:lineRule="auto"/>
+        <w:jc w:val="right"/>
+        <w:bidi w:val="1"/>
+      </w:pPr>
+      <w:r>
+        <w:rPr>
+          <w:rFonts w:ascii="Arial" w:hAnsi="Arial" w:cs="Arial" w:eastAsia="Arial"/>
+          <w:b w:val="0"/>
+          <w:color w:val="1A2332"/>
+          <w:sz w:val="22"/>
+        </w:rPr>
+        <w:t>متابعة حالة التوصيل والتدخل لو حصل تأخير.</w:t>
+      </w:r>
+    </w:p>
+    <w:p>
+      <w:pPr>
+        <w:pStyle w:val="ListBullet"/>
+        <w:spacing w:after="60" w:before="0" w:line="240" w:lineRule="auto"/>
+        <w:jc w:val="right"/>
+        <w:bidi w:val="1"/>
+      </w:pPr>
+      <w:r>
+        <w:rPr>
+          <w:rFonts w:ascii="Arial" w:hAnsi="Arial" w:cs="Arial" w:eastAsia="Arial"/>
+          <w:b w:val="0"/>
+          <w:color w:val="1A2332"/>
+          <w:sz w:val="22"/>
+        </w:rPr>
+        <w:t>التنسيق مع الدعم والتشغيل وقت الضغط.</w:t>
+      </w:r>
+    </w:p>
+    <w:p>
+      <w:pPr>
+        <w:spacing w:after="20" w:before="160" w:line="240" w:lineRule="auto"/>
         <w:jc w:val="right"/>
         <w:bidi w:val="1"/>
       </w:pPr>
@@ -418,10 +200,112 @@
         <w:rPr>
           <w:rFonts w:ascii="Arial" w:hAnsi="Arial" w:cs="Arial" w:eastAsia="Arial"/>
           <w:b/>
-          <w:color w:val="0B4F6C"/>
+          <w:color w:val="1A2332"/>
+          <w:sz w:val="24"/>
+        </w:rPr>
+        <w:t>Dispatcher — InstaShop</w:t>
+      </w:r>
+    </w:p>
+    <w:p>
+      <w:pPr>
+        <w:spacing w:after="60" w:before="0" w:line="240" w:lineRule="auto"/>
+        <w:jc w:val="right"/>
+        <w:bidi w:val="1"/>
+      </w:pPr>
+      <w:r>
+        <w:rPr>
+          <w:rFonts w:ascii="Arial" w:hAnsi="Arial" w:cs="Arial" w:eastAsia="Arial"/>
+          <w:b w:val="0"/>
+          <w:color w:val="5C6B7A"/>
+          <w:sz w:val="20"/>
+        </w:rPr>
+        <w:t>2024 – 2025</w:t>
+      </w:r>
+    </w:p>
+    <w:p>
+      <w:pPr>
+        <w:pStyle w:val="ListBullet"/>
+        <w:spacing w:after="60" w:before="0" w:line="240" w:lineRule="auto"/>
+        <w:jc w:val="right"/>
+        <w:bidi w:val="1"/>
+      </w:pPr>
+      <w:r>
+        <w:rPr>
+          <w:rFonts w:ascii="Arial" w:hAnsi="Arial" w:cs="Arial" w:eastAsia="Arial"/>
+          <w:b w:val="0"/>
+          <w:color w:val="1A2332"/>
           <w:sz w:val="22"/>
         </w:rPr>
-        <w:t>المعهد العالي بالتجمع الخامس</w:t>
+        <w:t>تنظيم شغل المناديب ومتابعة الأوردرات اليومية.</w:t>
+      </w:r>
+    </w:p>
+    <w:p>
+      <w:pPr>
+        <w:pStyle w:val="ListBullet"/>
+        <w:spacing w:after="60" w:before="0" w:line="240" w:lineRule="auto"/>
+        <w:jc w:val="right"/>
+        <w:bidi w:val="1"/>
+      </w:pPr>
+      <w:r>
+        <w:rPr>
+          <w:rFonts w:ascii="Arial" w:hAnsi="Arial" w:cs="Arial" w:eastAsia="Arial"/>
+          <w:b w:val="0"/>
+          <w:color w:val="1A2332"/>
+          <w:sz w:val="22"/>
+        </w:rPr>
+        <w:t>التعامل مع مشاكل التوصيل أثناء الشيفت.</w:t>
+      </w:r>
+    </w:p>
+    <w:p>
+      <w:pPr>
+        <w:pStyle w:val="ListBullet"/>
+        <w:spacing w:after="60" w:before="0" w:line="240" w:lineRule="auto"/>
+        <w:jc w:val="right"/>
+        <w:bidi w:val="1"/>
+      </w:pPr>
+      <w:r>
+        <w:rPr>
+          <w:rFonts w:ascii="Arial" w:hAnsi="Arial" w:cs="Arial" w:eastAsia="Arial"/>
+          <w:b w:val="0"/>
+          <w:color w:val="1A2332"/>
+          <w:sz w:val="22"/>
+        </w:rPr>
+        <w:t>التواصل مع العملاء عند الحاجة بخصوص حالة الطلب.</w:t>
+      </w:r>
+    </w:p>
+    <w:p>
+      <w:pPr>
+        <w:spacing w:after="160" w:before="240" w:line="240" w:lineRule="auto"/>
+        <w:jc w:val="right"/>
+        <w:bidi w:val="1"/>
+        <w:pBdr>
+          <w:bottom w:val="single" w:sz="18" w:space="4" w:color="0B4F6C"/>
+        </w:pBdr>
+      </w:pPr>
+      <w:r>
+        <w:rPr>
+          <w:rFonts w:ascii="Arial" w:hAnsi="Arial" w:cs="Arial" w:eastAsia="Arial"/>
+          <w:b/>
+          <w:color w:val="0B4F6C"/>
+          <w:sz w:val="26"/>
+        </w:rPr>
+        <w:t>التعليم</w:t>
+      </w:r>
+    </w:p>
+    <w:p>
+      <w:pPr>
+        <w:spacing w:after="20" w:before="0" w:line="240" w:lineRule="auto"/>
+        <w:jc w:val="right"/>
+        <w:bidi w:val="1"/>
+      </w:pPr>
+      <w:r>
+        <w:rPr>
+          <w:rFonts w:ascii="Arial" w:hAnsi="Arial" w:cs="Arial" w:eastAsia="Arial"/>
+          <w:b/>
+          <w:color w:val="1A2332"/>
+          <w:sz w:val="24"/>
+        </w:rPr>
+        <w:t>علوم حاسب — المعهد العالي بالتجمع الخامس</w:t>
       </w:r>
     </w:p>
     <w:p>
@@ -437,63 +321,12 @@
           <w:color w:val="5C6B7A"/>
           <w:sz w:val="20"/>
         </w:rPr>
-        <w:t>السنة الدراسية الحالية: السنة الثالثة  |  متوقع التخرج: 2027</w:t>
+        <w:t>سنة تالتة | متوقع التخرج 2027</w:t>
       </w:r>
     </w:p>
     <w:p>
       <w:pPr>
-        <w:pStyle w:val="ListBullet"/>
-        <w:spacing w:after="80" w:before="0" w:line="240" w:lineRule="auto"/>
-        <w:jc w:val="right"/>
-        <w:bidi w:val="1"/>
-      </w:pPr>
-      <w:r>
-        <w:rPr>
-          <w:rFonts w:ascii="Arial" w:hAnsi="Arial" w:cs="Arial" w:eastAsia="Arial"/>
-          <w:b w:val="0"/>
-          <w:color w:val="1A2332"/>
-          <w:sz w:val="22"/>
-        </w:rPr>
-        <w:t>دراسة تخصصات أساسية في علوم الحاسب تشمل البرمجة، قواعد البيانات، الشبكات، ونظم المعلومات.</w:t>
-      </w:r>
-    </w:p>
-    <w:p>
-      <w:pPr>
-        <w:pStyle w:val="ListBullet"/>
-        <w:spacing w:after="80" w:before="0" w:line="240" w:lineRule="auto"/>
-        <w:jc w:val="right"/>
-        <w:bidi w:val="1"/>
-      </w:pPr>
-      <w:r>
-        <w:rPr>
-          <w:rFonts w:ascii="Arial" w:hAnsi="Arial" w:cs="Arial" w:eastAsia="Arial"/>
-          <w:b w:val="0"/>
-          <w:color w:val="1A2332"/>
-          <w:sz w:val="22"/>
-        </w:rPr>
-        <w:t>تنمية مهارات التفكير التحليلي وحل المشكلات من خلال المقررات العملية والمشروعات الدراسية.</w:t>
-      </w:r>
-    </w:p>
-    <w:p>
-      <w:pPr>
-        <w:pStyle w:val="ListBullet"/>
-        <w:spacing w:after="80" w:before="0" w:line="240" w:lineRule="auto"/>
-        <w:jc w:val="right"/>
-        <w:bidi w:val="1"/>
-      </w:pPr>
-      <w:r>
-        <w:rPr>
-          <w:rFonts w:ascii="Arial" w:hAnsi="Arial" w:cs="Arial" w:eastAsia="Arial"/>
-          <w:b w:val="0"/>
-          <w:color w:val="1A2332"/>
-          <w:sz w:val="22"/>
-        </w:rPr>
-        <w:t>الجمع بين الدراسة الأكاديمية والخبرة العملية في مجال العمليات والتوصيل لتعزيز الجاهزية لسوق العمل.</w:t>
-      </w:r>
-    </w:p>
-    <w:p>
-      <w:pPr>
-        <w:spacing w:after="160" w:before="280" w:line="240" w:lineRule="auto"/>
+        <w:spacing w:after="160" w:before="240" w:line="240" w:lineRule="auto"/>
         <w:jc w:val="right"/>
         <w:bidi w:val="1"/>
         <w:pBdr>
@@ -505,15 +338,15 @@
           <w:rFonts w:ascii="Arial" w:hAnsi="Arial" w:cs="Arial" w:eastAsia="Arial"/>
           <w:b/>
           <w:color w:val="0B4F6C"/>
-          <w:sz w:val="28"/>
+          <w:sz w:val="26"/>
         </w:rPr>
-        <w:t>المهارات المهنية</w:t>
+        <w:t>المهارات</w:t>
       </w:r>
     </w:p>
     <w:p>
       <w:pPr>
         <w:pStyle w:val="ListBullet"/>
-        <w:spacing w:after="80" w:before="0" w:line="240" w:lineRule="auto"/>
+        <w:spacing w:after="60" w:before="0" w:line="240" w:lineRule="auto"/>
         <w:jc w:val="right"/>
         <w:bidi w:val="1"/>
       </w:pPr>
@@ -524,13 +357,13 @@
           <w:color w:val="1A2332"/>
           <w:sz w:val="22"/>
         </w:rPr>
-        <w:t>إدارة عمليات التوصيل</w:t>
+        <w:t>توزيع ومتابعة الأوردرات</w:t>
       </w:r>
     </w:p>
     <w:p>
       <w:pPr>
         <w:pStyle w:val="ListBullet"/>
-        <w:spacing w:after="80" w:before="0" w:line="240" w:lineRule="auto"/>
+        <w:spacing w:after="60" w:before="0" w:line="240" w:lineRule="auto"/>
         <w:jc w:val="right"/>
         <w:bidi w:val="1"/>
       </w:pPr>
@@ -541,13 +374,13 @@
           <w:color w:val="1A2332"/>
           <w:sz w:val="22"/>
         </w:rPr>
-        <w:t>توزيع الطلبات والمتابعة اللحظية</w:t>
+        <w:t>العمل تحت الضغط</w:t>
       </w:r>
     </w:p>
     <w:p>
       <w:pPr>
         <w:pStyle w:val="ListBullet"/>
-        <w:spacing w:after="80" w:before="0" w:line="240" w:lineRule="auto"/>
+        <w:spacing w:after="60" w:before="0" w:line="240" w:lineRule="auto"/>
         <w:jc w:val="right"/>
         <w:bidi w:val="1"/>
       </w:pPr>
@@ -558,13 +391,13 @@
           <w:color w:val="1A2332"/>
           <w:sz w:val="22"/>
         </w:rPr>
-        <w:t>خدمة العملاء والتنسيق بين الفرق</w:t>
+        <w:t>التواصل مع المناديب والعملاء</w:t>
       </w:r>
     </w:p>
     <w:p>
       <w:pPr>
         <w:pStyle w:val="ListBullet"/>
-        <w:spacing w:after="80" w:before="0" w:line="240" w:lineRule="auto"/>
+        <w:spacing w:after="60" w:before="0" w:line="240" w:lineRule="auto"/>
         <w:jc w:val="right"/>
         <w:bidi w:val="1"/>
       </w:pPr>
@@ -575,13 +408,13 @@
           <w:color w:val="1A2332"/>
           <w:sz w:val="22"/>
         </w:rPr>
-        <w:t>العمل تحت الضغط وحل المشكلات التشغيلية</w:t>
+        <w:t>Microsoft Office / Excel</w:t>
       </w:r>
     </w:p>
     <w:p>
       <w:pPr>
         <w:pStyle w:val="ListBullet"/>
-        <w:spacing w:after="80" w:before="0" w:line="240" w:lineRule="auto"/>
+        <w:spacing w:after="60" w:before="0" w:line="240" w:lineRule="auto"/>
         <w:jc w:val="right"/>
         <w:bidi w:val="1"/>
       </w:pPr>
@@ -592,321 +425,7 @@
           <w:color w:val="1A2332"/>
           <w:sz w:val="22"/>
         </w:rPr>
-        <w:t>إعداد التقارير اليومية ومتابعة مؤشرات الأداء</w:t>
-      </w:r>
-    </w:p>
-    <w:p>
-      <w:pPr>
-        <w:spacing w:after="160" w:before="280" w:line="240" w:lineRule="auto"/>
-        <w:jc w:val="right"/>
-        <w:bidi w:val="1"/>
-        <w:pBdr>
-          <w:bottom w:val="single" w:sz="18" w:space="4" w:color="0B4F6C"/>
-        </w:pBdr>
-      </w:pPr>
-      <w:r>
-        <w:rPr>
-          <w:rFonts w:ascii="Arial" w:hAnsi="Arial" w:cs="Arial" w:eastAsia="Arial"/>
-          <w:b/>
-          <w:color w:val="0B4F6C"/>
-          <w:sz w:val="28"/>
-        </w:rPr>
-        <w:t>المهارات التقنية</w:t>
-      </w:r>
-    </w:p>
-    <w:p>
-      <w:pPr>
-        <w:pStyle w:val="ListBullet"/>
-        <w:spacing w:after="80" w:before="0" w:line="240" w:lineRule="auto"/>
-        <w:jc w:val="right"/>
-        <w:bidi w:val="1"/>
-      </w:pPr>
-      <w:r>
-        <w:rPr>
-          <w:rFonts w:ascii="Arial" w:hAnsi="Arial" w:cs="Arial" w:eastAsia="Arial"/>
-          <w:b w:val="0"/>
-          <w:color w:val="1A2332"/>
-          <w:sz w:val="22"/>
-        </w:rPr>
-        <w:t>أنظمة إدارة الطلبات وتطبيقات التوصيل</w:t>
-      </w:r>
-    </w:p>
-    <w:p>
-      <w:pPr>
-        <w:pStyle w:val="ListBullet"/>
-        <w:spacing w:after="80" w:before="0" w:line="240" w:lineRule="auto"/>
-        <w:jc w:val="right"/>
-        <w:bidi w:val="1"/>
-      </w:pPr>
-      <w:r>
-        <w:rPr>
-          <w:rFonts w:ascii="Arial" w:hAnsi="Arial" w:cs="Arial" w:eastAsia="Arial"/>
-          <w:b w:val="0"/>
-          <w:color w:val="1A2332"/>
-          <w:sz w:val="22"/>
-        </w:rPr>
-        <w:t>Microsoft Office و Excel</w:t>
-      </w:r>
-    </w:p>
-    <w:p>
-      <w:pPr>
-        <w:pStyle w:val="ListBullet"/>
-        <w:spacing w:after="80" w:before="0" w:line="240" w:lineRule="auto"/>
-        <w:jc w:val="right"/>
-        <w:bidi w:val="1"/>
-      </w:pPr>
-      <w:r>
-        <w:rPr>
-          <w:rFonts w:ascii="Arial" w:hAnsi="Arial" w:cs="Arial" w:eastAsia="Arial"/>
-          <w:b w:val="0"/>
-          <w:color w:val="1A2332"/>
-          <w:sz w:val="22"/>
-        </w:rPr>
-        <w:t>أساسيات علوم الحاسب والتعامل مع البيانات</w:t>
-      </w:r>
-    </w:p>
-    <w:p>
-      <w:pPr>
-        <w:spacing w:after="160" w:before="280" w:line="240" w:lineRule="auto"/>
-        <w:jc w:val="right"/>
-        <w:bidi w:val="1"/>
-        <w:pBdr>
-          <w:bottom w:val="single" w:sz="18" w:space="4" w:color="0B4F6C"/>
-        </w:pBdr>
-      </w:pPr>
-      <w:r>
-        <w:rPr>
-          <w:rFonts w:ascii="Arial" w:hAnsi="Arial" w:cs="Arial" w:eastAsia="Arial"/>
-          <w:b/>
-          <w:color w:val="0B4F6C"/>
-          <w:sz w:val="28"/>
-        </w:rPr>
-        <w:t>الكفاءات الشخصية</w:t>
-      </w:r>
-    </w:p>
-    <w:p>
-      <w:pPr>
-        <w:pStyle w:val="ListBullet"/>
-        <w:spacing w:after="80" w:before="0" w:line="240" w:lineRule="auto"/>
-        <w:jc w:val="right"/>
-        <w:bidi w:val="1"/>
-      </w:pPr>
-      <w:r>
-        <w:rPr>
-          <w:rFonts w:ascii="Arial" w:hAnsi="Arial" w:cs="Arial" w:eastAsia="Arial"/>
-          <w:b w:val="0"/>
-          <w:color w:val="1A2332"/>
-          <w:sz w:val="22"/>
-        </w:rPr>
-        <w:t>انضباط عالٍ والتزام بالمواعيد</w:t>
-      </w:r>
-    </w:p>
-    <w:p>
-      <w:pPr>
-        <w:pStyle w:val="ListBullet"/>
-        <w:spacing w:after="80" w:before="0" w:line="240" w:lineRule="auto"/>
-        <w:jc w:val="right"/>
-        <w:bidi w:val="1"/>
-      </w:pPr>
-      <w:r>
-        <w:rPr>
-          <w:rFonts w:ascii="Arial" w:hAnsi="Arial" w:cs="Arial" w:eastAsia="Arial"/>
-          <w:b w:val="0"/>
-          <w:color w:val="1A2332"/>
-          <w:sz w:val="22"/>
-        </w:rPr>
-        <w:t>تواصل واضح وفعّال</w:t>
-      </w:r>
-    </w:p>
-    <w:p>
-      <w:pPr>
-        <w:pStyle w:val="ListBullet"/>
-        <w:spacing w:after="80" w:before="0" w:line="240" w:lineRule="auto"/>
-        <w:jc w:val="right"/>
-        <w:bidi w:val="1"/>
-      </w:pPr>
-      <w:r>
-        <w:rPr>
-          <w:rFonts w:ascii="Arial" w:hAnsi="Arial" w:cs="Arial" w:eastAsia="Arial"/>
-          <w:b w:val="0"/>
-          <w:color w:val="1A2332"/>
-          <w:sz w:val="22"/>
-        </w:rPr>
-        <w:t>قدرة على اتخاذ قرارات سريعة</w:t>
-      </w:r>
-    </w:p>
-    <w:p>
-      <w:pPr>
-        <w:pStyle w:val="ListBullet"/>
-        <w:spacing w:after="80" w:before="0" w:line="240" w:lineRule="auto"/>
-        <w:jc w:val="right"/>
-        <w:bidi w:val="1"/>
-      </w:pPr>
-      <w:r>
-        <w:rPr>
-          <w:rFonts w:ascii="Arial" w:hAnsi="Arial" w:cs="Arial" w:eastAsia="Arial"/>
-          <w:b w:val="0"/>
-          <w:color w:val="1A2332"/>
-          <w:sz w:val="22"/>
-        </w:rPr>
-        <w:t>روح تعاون ومرونة في العمل</w:t>
-      </w:r>
-    </w:p>
-    <w:p>
-      <w:pPr>
-        <w:pStyle w:val="ListBullet"/>
-        <w:spacing w:after="80" w:before="0" w:line="240" w:lineRule="auto"/>
-        <w:jc w:val="right"/>
-        <w:bidi w:val="1"/>
-      </w:pPr>
-      <w:r>
-        <w:rPr>
-          <w:rFonts w:ascii="Arial" w:hAnsi="Arial" w:cs="Arial" w:eastAsia="Arial"/>
-          <w:b w:val="0"/>
-          <w:color w:val="1A2332"/>
-          <w:sz w:val="22"/>
-        </w:rPr>
-        <w:t>دقة في المتابعة والتوثيق</w:t>
-      </w:r>
-    </w:p>
-    <w:p>
-      <w:pPr>
-        <w:pStyle w:val="ListBullet"/>
-        <w:spacing w:after="80" w:before="0" w:line="240" w:lineRule="auto"/>
-        <w:jc w:val="right"/>
-        <w:bidi w:val="1"/>
-      </w:pPr>
-      <w:r>
-        <w:rPr>
-          <w:rFonts w:ascii="Arial" w:hAnsi="Arial" w:cs="Arial" w:eastAsia="Arial"/>
-          <w:b w:val="0"/>
-          <w:color w:val="1A2332"/>
-          <w:sz w:val="22"/>
-        </w:rPr>
-        <w:t>قابلية تعلم سريعة</w:t>
-      </w:r>
-    </w:p>
-    <w:p>
-      <w:pPr>
-        <w:spacing w:after="160" w:before="280" w:line="240" w:lineRule="auto"/>
-        <w:jc w:val="right"/>
-        <w:bidi w:val="1"/>
-        <w:pBdr>
-          <w:bottom w:val="single" w:sz="18" w:space="4" w:color="0B4F6C"/>
-        </w:pBdr>
-      </w:pPr>
-      <w:r>
-        <w:rPr>
-          <w:rFonts w:ascii="Arial" w:hAnsi="Arial" w:cs="Arial" w:eastAsia="Arial"/>
-          <w:b/>
-          <w:color w:val="0B4F6C"/>
-          <w:sz w:val="28"/>
-        </w:rPr>
-        <w:t>اللغات</w:t>
-      </w:r>
-    </w:p>
-    <w:p>
-      <w:pPr>
-        <w:pStyle w:val="ListBullet"/>
-        <w:spacing w:after="80" w:before="0" w:line="240" w:lineRule="auto"/>
-        <w:jc w:val="right"/>
-        <w:bidi w:val="1"/>
-      </w:pPr>
-      <w:r>
-        <w:rPr>
-          <w:rFonts w:ascii="Arial" w:hAnsi="Arial" w:cs="Arial" w:eastAsia="Arial"/>
-          <w:b w:val="0"/>
-          <w:color w:val="1A2332"/>
-          <w:sz w:val="22"/>
-        </w:rPr>
-        <w:t>العربية — لغة أم</w:t>
-      </w:r>
-    </w:p>
-    <w:p>
-      <w:pPr>
-        <w:pStyle w:val="ListBullet"/>
-        <w:spacing w:after="80" w:before="0" w:line="240" w:lineRule="auto"/>
-        <w:jc w:val="right"/>
-        <w:bidi w:val="1"/>
-      </w:pPr>
-      <w:r>
-        <w:rPr>
-          <w:rFonts w:ascii="Arial" w:hAnsi="Arial" w:cs="Arial" w:eastAsia="Arial"/>
-          <w:b w:val="0"/>
-          <w:color w:val="1A2332"/>
-          <w:sz w:val="22"/>
-        </w:rPr>
-        <w:t>الإنجليزية — مستوى متوسط</w:t>
-      </w:r>
-    </w:p>
-    <w:p>
-      <w:pPr>
-        <w:spacing w:after="160" w:before="280" w:line="240" w:lineRule="auto"/>
-        <w:jc w:val="right"/>
-        <w:bidi w:val="1"/>
-        <w:pBdr>
-          <w:bottom w:val="single" w:sz="18" w:space="4" w:color="0B4F6C"/>
-        </w:pBdr>
-      </w:pPr>
-      <w:r>
-        <w:rPr>
-          <w:rFonts w:ascii="Arial" w:hAnsi="Arial" w:cs="Arial" w:eastAsia="Arial"/>
-          <w:b/>
-          <w:color w:val="0B4F6C"/>
-          <w:sz w:val="28"/>
-        </w:rPr>
-        <w:t>بيانات شخصية</w:t>
-      </w:r>
-    </w:p>
-    <w:p>
-      <w:pPr>
-        <w:pStyle w:val="ListBullet"/>
-        <w:spacing w:after="80" w:before="0" w:line="240" w:lineRule="auto"/>
-        <w:jc w:val="right"/>
-        <w:bidi w:val="1"/>
-      </w:pPr>
-      <w:r>
-        <w:rPr>
-          <w:rFonts w:ascii="Arial" w:hAnsi="Arial" w:cs="Arial" w:eastAsia="Arial"/>
-          <w:b w:val="0"/>
-          <w:color w:val="1A2332"/>
-          <w:sz w:val="22"/>
-        </w:rPr>
-        <w:t>الجنسية: مصري</w:t>
-      </w:r>
-    </w:p>
-    <w:p>
-      <w:pPr>
-        <w:pStyle w:val="ListBullet"/>
-        <w:spacing w:after="80" w:before="0" w:line="240" w:lineRule="auto"/>
-        <w:jc w:val="right"/>
-        <w:bidi w:val="1"/>
-      </w:pPr>
-      <w:r>
-        <w:rPr>
-          <w:rFonts w:ascii="Arial" w:hAnsi="Arial" w:cs="Arial" w:eastAsia="Arial"/>
-          <w:b w:val="0"/>
-          <w:color w:val="1A2332"/>
-          <w:sz w:val="22"/>
-        </w:rPr>
-        <w:t>الموقع: القاهرة، مصر</w:t>
-      </w:r>
-    </w:p>
-    <w:p>
-      <w:pPr>
-        <w:pStyle w:val="ListBullet"/>
-        <w:spacing w:after="80" w:before="0" w:line="240" w:lineRule="auto"/>
-        <w:jc w:val="right"/>
-        <w:bidi w:val="1"/>
-      </w:pPr>
-      <w:r>
-        <w:rPr>
-          <w:rFonts w:ascii="Arial" w:hAnsi="Arial" w:cs="Arial" w:eastAsia="Arial"/>
-          <w:b w:val="0"/>
-          <w:color w:val="1A2332"/>
-          <w:sz w:val="22"/>
-        </w:rPr>
-        <w:t>التفرّغ: متاح للعمل</w:t>
+        <w:t>العربية، وإنجليزي متوسط</w:t>
       </w:r>
     </w:p>
     <w:sectPr>

</xml_diff>

<commit_message>
Update education and header wording on CV
Show bachelor's with expected graduation 2027, and remove student title from the header.

Co-authored-by: abdelrahman Hamdy <abdoe317111@gmail.com>
</commit_message>
<xml_diff>
--- a/CV-Mahmoud-Hamed.docx
+++ b/CV-Mahmoud-Hamed.docx
@@ -31,7 +31,7 @@
           <w:color w:val="1A2332"/>
           <w:sz w:val="24"/>
         </w:rPr>
-        <w:t>Dispatcher | طالب علوم حاسب</w:t>
+        <w:t>Dispatcher</w:t>
       </w:r>
     </w:p>
     <w:p>
@@ -85,7 +85,7 @@
           <w:color w:val="1A2332"/>
           <w:sz w:val="22"/>
         </w:rPr>
-        <w:t>شغال Dispatcher في شركات توصيل، وبطالب علوم حاسب سنة تالتة. متعود أوزع أوردرات، أتابع المناديب، وأحل مشاكل الشيفت بسرعة.</w:t>
+        <w:t>شغال Dispatcher في شركات توصيل. متعود أوزع أوردرات، أتابع المناديب، وأحل مشاكل الشيفت بسرعة.</w:t>
       </w:r>
     </w:p>
     <w:p>
@@ -305,7 +305,7 @@
           <w:color w:val="1A2332"/>
           <w:sz w:val="24"/>
         </w:rPr>
-        <w:t>علوم حاسب — المعهد العالي بالتجمع الخامس</w:t>
+        <w:t>بكالوريوس علوم حاسب — المعهد العالي بالتجمع الخامس</w:t>
       </w:r>
     </w:p>
     <w:p>
@@ -321,7 +321,7 @@
           <w:color w:val="5C6B7A"/>
           <w:sz w:val="20"/>
         </w:rPr>
-        <w:t>سنة تالتة | متوقع التخرج 2027</w:t>
+        <w:t>متوقع التخرج 2027</w:t>
       </w:r>
     </w:p>
     <w:p>

</xml_diff>

<commit_message>
Use formal Arabic and keep Dispatcher-only header
Rewrite CV wording in fus'ha and ensure the HTML header has no student title.

Co-authored-by: abdelrahman Hamdy <abdoe317111@gmail.com>
</commit_message>
<xml_diff>
--- a/CV-Mahmoud-Hamed.docx
+++ b/CV-Mahmoud-Hamed.docx
@@ -85,7 +85,7 @@
           <w:color w:val="1A2332"/>
           <w:sz w:val="22"/>
         </w:rPr>
-        <w:t>شغال Dispatcher في شركات توصيل. متعود أوزع أوردرات، أتابع المناديب، وأحل مشاكل الشيفت بسرعة.</w:t>
+        <w:t>خبرة في عمل الـ Dispatcher بشركات التوصيل، وتشمل توزيع الطلبات ومتابعة المناديب ومعالجة المشكلات أثناء الشيفت.</w:t>
       </w:r>
     </w:p>
     <w:p>
@@ -153,7 +153,7 @@
           <w:color w:val="1A2332"/>
           <w:sz w:val="22"/>
         </w:rPr>
-        <w:t>توزيع الأوردرات على المناديب حسب المنطقة والوقت.</w:t>
+        <w:t>توزيع الطلبات على المناديب حسب المنطقة والوقت.</w:t>
       </w:r>
     </w:p>
     <w:p>
@@ -170,7 +170,7 @@
           <w:color w:val="1A2332"/>
           <w:sz w:val="22"/>
         </w:rPr>
-        <w:t>متابعة حالة التوصيل والتدخل لو حصل تأخير.</w:t>
+        <w:t>متابعة حالة التوصيل والتدخل عند حدوث تأخير.</w:t>
       </w:r>
     </w:p>
     <w:p>
@@ -187,7 +187,7 @@
           <w:color w:val="1A2332"/>
           <w:sz w:val="22"/>
         </w:rPr>
-        <w:t>التنسيق مع الدعم والتشغيل وقت الضغط.</w:t>
+        <w:t>التنسيق مع فريقي الدعم والتشغيل في أوقات الضغط.</w:t>
       </w:r>
     </w:p>
     <w:p>
@@ -236,7 +236,7 @@
           <w:color w:val="1A2332"/>
           <w:sz w:val="22"/>
         </w:rPr>
-        <w:t>تنظيم شغل المناديب ومتابعة الأوردرات اليومية.</w:t>
+        <w:t>تنظيم عمل المناديب ومتابعة الطلبات اليومية.</w:t>
       </w:r>
     </w:p>
     <w:p>
@@ -253,7 +253,7 @@
           <w:color w:val="1A2332"/>
           <w:sz w:val="22"/>
         </w:rPr>
-        <w:t>التعامل مع مشاكل التوصيل أثناء الشيفت.</w:t>
+        <w:t>معالجة مشكلات التوصيل أثناء الشيفت.</w:t>
       </w:r>
     </w:p>
     <w:p>
@@ -357,7 +357,7 @@
           <w:color w:val="1A2332"/>
           <w:sz w:val="22"/>
         </w:rPr>
-        <w:t>توزيع ومتابعة الأوردرات</w:t>
+        <w:t>توزيع الطلبات ومتابعتها</w:t>
       </w:r>
     </w:p>
     <w:p>
@@ -425,7 +425,7 @@
           <w:color w:val="1A2332"/>
           <w:sz w:val="22"/>
         </w:rPr>
-        <w:t>العربية، وإنجليزي متوسط</w:t>
+        <w:t>العربية، والإنجليزية بمستوى متوسط</w:t>
       </w:r>
     </w:p>
     <w:sectPr>

</xml_diff>